<commit_message>
Move webapp installation instructions to the beginning of gebruikershandleiding docx
</commit_message>
<xml_diff>
--- a/Digidokters_Gebruikershandleiding.docx
+++ b/Digidokters_Gebruikershandleiding.docx
@@ -60,8 +60,7 @@
         <w:pStyle w:val="Heading1"/>
       </w:pPr>
       <w:r>
-        <w:lastRenderedPageBreak/>
-        <w:t>1. Toegang tot de app</w:t>
+        <w:t>1. De app installeren als webapp</w:t>
       </w:r>
     </w:p>
     <w:p>
@@ -69,26 +68,7 @@
         <w:spacing w:after="160"/>
       </w:pPr>
       <w:r>
-        <w:t>De Digidokters-app is een webapplicatie en is bereikbaar via elke browser, op computer, tablet of smartphone.</w:t>
-      </w:r>
-    </w:p>
-    <w:p>
-      <w:pPr>
-        <w:spacing w:after="200"/>
-      </w:pPr>
-      <w:r>
-        <w:rPr>
-          <w:b/>
-          <w:bCs/>
-        </w:rPr>
-        <w:t xml:space="preserve">Webadres: </w:t>
-      </w:r>
-      <w:r>
-        <w:rPr>
-          <w:color w:val="2563EB"/>
-          <w:u w:val="single"/>
-        </w:rPr>
-        <w:t>https://digidokters.onrender.com</w:t>
+        <w:t>Digidokters is een Progressive Web App (PWA): u kan de app op uw beginscherm zetten, zodat ze aanvoelt als een gewone app — met eigen icoon, zonder browserbalken.</w:t>
       </w:r>
     </w:p>
     <w:p>
@@ -96,7 +76,7 @@
         <w:pStyle w:val="Heading2"/>
       </w:pPr>
       <w:r>
-        <w:t>1.1 Inloggen</w:t>
+        <w:t>1.1 Op iPhone / iPad (Safari)</w:t>
       </w:r>
     </w:p>
     <w:p>
@@ -104,7 +84,7 @@
         <w:spacing w:after="160"/>
       </w:pPr>
       <w:r>
-        <w:t>Log in met uw naam en wachtwoord, zoals aangemaakt door de beheerder.</w:t>
+        <w:t>Belangrijk: dit werkt enkel via de Safari-browser, niet via Chrome of een andere browser op iOS.</w:t>
       </w:r>
     </w:p>
     <w:p>
@@ -117,7 +97,7 @@
         <w:spacing w:after="80"/>
       </w:pPr>
       <w:r>
-        <w:t>Ga naar https://digidokters.onrender.com</w:t>
+        <w:t>Open Safari en surf naar https://digidokters.onrender.com</w:t>
       </w:r>
     </w:p>
     <w:p>
@@ -130,7 +110,7 @@
         <w:spacing w:after="80"/>
       </w:pPr>
       <w:r>
-        <w:t>Vul uw naam in bij 'Naam'.</w:t>
+        <w:t>Tik onderaan op het deel-icoon (vierkant met pijl naar boven).</w:t>
       </w:r>
     </w:p>
     <w:p>
@@ -143,7 +123,7 @@
         <w:spacing w:after="80"/>
       </w:pPr>
       <w:r>
-        <w:t>Vul uw wachtwoord in.</w:t>
+        <w:t>Scrol in het menu naar beneden en tik op 'Zet op beginscherm'.</w:t>
       </w:r>
     </w:p>
     <w:p>
@@ -156,7 +136,7 @@
         <w:spacing w:after="80"/>
       </w:pPr>
       <w:r>
-        <w:t>Klik op 'Aanmelden'.</w:t>
+        <w:t>Bevestig de naam ('Digidokters') en tik rechtsboven op 'Voeg toe'.</w:t>
       </w:r>
     </w:p>
     <w:p>
@@ -169,15 +149,7 @@
         <w:spacing w:after="160"/>
       </w:pPr>
       <w:r>
-        <w:t>Bij de allereerste aanmelding met een tijdelijk wachtwoord vraagt de app u om onmiddellijk een nieuw, persoonlijk wachtwoord in te stellen. Dit wachtwoord moet minstens 8 tekens bevatten, met minstens één hoofdletter en één cijfer.</w:t>
-      </w:r>
-    </w:p>
-    <w:p>
-      <w:pPr>
-        <w:pStyle w:val="Heading1"/>
-      </w:pPr>
-      <w:r>
-        <w:t>2. De app gebruiken</w:t>
+        <w:t>Het Digidokters-icoon verschijnt nu op uw beginscherm en opent de app in volledig scherm, zonder Safari-adresbalk.</w:t>
       </w:r>
     </w:p>
     <w:p>
@@ -185,101 +157,7 @@
         <w:pStyle w:val="Heading2"/>
       </w:pPr>
       <w:r>
-        <w:t>2.1 Registraties bekijken</w:t>
-      </w:r>
-    </w:p>
-    <w:p>
-      <w:pPr>
-        <w:spacing w:after="160"/>
-      </w:pPr>
-      <w:r>
-        <w:t>Het menu-item 'Registraties' toont een overzicht van alle geregistreerde bezoeken: datum, cliënt, digidokter, onderwerp, leeftijdscategorie en toestel. U kan de lijst doorzoeken en filteren.</w:t>
-      </w:r>
-    </w:p>
-    <w:p>
-      <w:pPr>
-        <w:pStyle w:val="Heading2"/>
-      </w:pPr>
-      <w:r>
-        <w:t>2.2 Een nieuw bezoek registreren</w:t>
-      </w:r>
-    </w:p>
-    <w:p>
-      <w:pPr>
-        <w:spacing w:after="160"/>
-      </w:pPr>
-      <w:r>
-        <w:t>Klik in het menu op 'Nieuw bezoek' om een nieuwe registratie toe te voegen. Vul de gevraagde gegevens in (datum, naam van de cliënt, digidokter, leeftijdscategorie, toestel en een korte omschrijving van de hulpvraag) en klik op 'Opslaan'.</w:t>
-      </w:r>
-    </w:p>
-    <w:p>
-      <w:pPr>
-        <w:pStyle w:val="Heading2"/>
-      </w:pPr>
-      <w:r>
-        <w:t>2.3 Exporteren</w:t>
-      </w:r>
-    </w:p>
-    <w:p>
-      <w:pPr>
-        <w:spacing w:after="160"/>
-      </w:pPr>
-      <w:r>
-        <w:t>Via 'Exporteren' kan u alle (of gefilterde) registraties downloaden als Excel-bestand.</w:t>
-      </w:r>
-    </w:p>
-    <w:p>
-      <w:pPr>
-        <w:pStyle w:val="Heading2"/>
-      </w:pPr>
-      <w:r>
-        <w:t>2.4 Statistieken</w:t>
-      </w:r>
-    </w:p>
-    <w:p>
-      <w:pPr>
-        <w:spacing w:after="160"/>
-      </w:pPr>
-      <w:r>
-        <w:t>Onder 'Statistieken' vindt u overzichten en grafieken: aantal bezoeken per digidokter, per leeftijdscategorie, per toestel, en de evolutie doorheen het jaar.</w:t>
-      </w:r>
-    </w:p>
-    <w:p>
-      <w:r>
-        <w:br w:type="page"/>
-      </w:r>
-    </w:p>
-    <w:p>
-      <w:pPr>
-        <w:pStyle w:val="Heading1"/>
-      </w:pPr>
-      <w:r>
-        <w:lastRenderedPageBreak/>
-        <w:t>3. De app installeren als webapp</w:t>
-      </w:r>
-    </w:p>
-    <w:p>
-      <w:pPr>
-        <w:spacing w:after="160"/>
-      </w:pPr>
-      <w:r>
-        <w:t>Digidokters is een Progressive Web App (PWA): u kan de app op uw beginscherm zetten, zodat ze aanvoelt als een gewone app — met eigen icoon, zonder browserbalken.</w:t>
-      </w:r>
-    </w:p>
-    <w:p>
-      <w:pPr>
-        <w:pStyle w:val="Heading2"/>
-      </w:pPr>
-      <w:r>
-        <w:t>3.1 Op iPhone / iPad (Safari)</w:t>
-      </w:r>
-    </w:p>
-    <w:p>
-      <w:pPr>
-        <w:spacing w:after="160"/>
-      </w:pPr>
-      <w:r>
-        <w:t>Belangrijk: dit werkt enkel via de Safari-browser, niet via Chrome of een andere browser op iOS.</w:t>
+        <w:t>1.2 Op Android (Chrome)</w:t>
       </w:r>
     </w:p>
     <w:p>
@@ -292,7 +170,7 @@
         <w:spacing w:after="80"/>
       </w:pPr>
       <w:r>
-        <w:t>Open Safari en surf naar https://digidokters.onrender.com</w:t>
+        <w:t>Open Chrome en surf naar https://digidokters.onrender.com</w:t>
       </w:r>
     </w:p>
     <w:p>
@@ -305,7 +183,7 @@
         <w:spacing w:after="80"/>
       </w:pPr>
       <w:r>
-        <w:t>Tik onderaan op het deel-icoon (vierkant met pijl naar boven).</w:t>
+        <w:t>Tik op het installatie-icoontje in de adresbalk, of open het menu (drie puntjes rechtsboven) en tik op 'App installeren'.</w:t>
       </w:r>
     </w:p>
     <w:p>
@@ -318,7 +196,28 @@
         <w:spacing w:after="80"/>
       </w:pPr>
       <w:r>
-        <w:t>Scrol in het menu naar beneden en tik op 'Zet op beginscherm'.</w:t>
+        <w:t>Bevestig door op 'Installeren' te tikken.</w:t>
+      </w:r>
+    </w:p>
+    <w:p>
+      <w:pPr>
+        <w:spacing w:after="160"/>
+      </w:pPr>
+    </w:p>
+    <w:p>
+      <w:pPr>
+        <w:spacing w:after="160"/>
+      </w:pPr>
+      <w:r>
+        <w:t>De app verschijnt vervolgens als apart icoon in uw app-lade, los van de browser.</w:t>
+      </w:r>
+    </w:p>
+    <w:p>
+      <w:pPr>
+        <w:pStyle w:val="Heading2"/>
+      </w:pPr>
+      <w:r>
+        <w:t>1.3 Op computer (Windows / Mac)</w:t>
       </w:r>
     </w:p>
     <w:p>
@@ -331,28 +230,7 @@
         <w:spacing w:after="80"/>
       </w:pPr>
       <w:r>
-        <w:t>Bevestig de naam ('Digidokters') en tik rechtsboven op 'Voeg toe'.</w:t>
-      </w:r>
-    </w:p>
-    <w:p>
-      <w:pPr>
-        <w:spacing w:after="160"/>
-      </w:pPr>
-    </w:p>
-    <w:p>
-      <w:pPr>
-        <w:spacing w:after="160"/>
-      </w:pPr>
-      <w:r>
-        <w:t>Het Digidokters-icoon verschijnt nu op uw beginscherm en opent de app in volledig scherm, zonder Safari-adresbalk.</w:t>
-      </w:r>
-    </w:p>
-    <w:p>
-      <w:pPr>
-        <w:pStyle w:val="Heading2"/>
-      </w:pPr>
-      <w:r>
-        <w:t>3.2 Op Android (Chrome)</w:t>
+        <w:t>Open de website in Chrome of Edge.</w:t>
       </w:r>
     </w:p>
     <w:p>
@@ -365,7 +243,7 @@
         <w:spacing w:after="80"/>
       </w:pPr>
       <w:r>
-        <w:t>Open Chrome en surf naar https://digidokters.onrender.com</w:t>
+        <w:t>Klik op het installatie-icoontje rechts in de adresbalk (een beeldscherm met pijltje).</w:t>
       </w:r>
     </w:p>
     <w:p>
@@ -378,7 +256,83 @@
         <w:spacing w:after="80"/>
       </w:pPr>
       <w:r>
-        <w:t>Tik op het installatie-icoontje in de adresbalk, of open het menu (drie puntjes rechtsboven) en tik op 'App installeren'.</w:t>
+        <w:t>Klik op 'Installeren'.</w:t>
+      </w:r>
+    </w:p>
+    <w:p>
+      <w:pPr>
+        <w:spacing w:after="160"/>
+      </w:pPr>
+    </w:p>
+    <w:p>
+      <w:pPr>
+        <w:pBdr>
+          <w:left w:val="single" w:sz="18" w:space="8" w:color="2563EB"/>
+        </w:pBdr>
+        <w:shd w:val="clear" w:color="auto" w:fill="F1F5F9"/>
+        <w:spacing w:before="100" w:after="200"/>
+        <w:ind w:left="215"/>
+      </w:pPr>
+      <w:r>
+        <w:rPr>
+          <w:b/>
+          <w:bCs/>
+        </w:rPr>
+        <w:t xml:space="preserve">Tip: </w:t>
+      </w:r>
+      <w:r>
+        <w:t>Na installatie werkt de app hetzelfde als in de browser — het is enkel een snellere, opgeruimdere manier om ze te openen.</w:t>
+      </w:r>
+    </w:p>
+    <w:p>
+      <w:pPr>
+        <w:pStyle w:val="Heading1"/>
+      </w:pPr>
+      <w:r>
+        <w:t>2. Toegang tot de app</w:t>
+      </w:r>
+    </w:p>
+    <w:p>
+      <w:pPr>
+        <w:spacing w:after="160"/>
+      </w:pPr>
+      <w:r>
+        <w:t>De Digidokters-app is een webapplicatie en is bereikbaar via elke browser, op computer, tablet of smartphone.</w:t>
+      </w:r>
+    </w:p>
+    <w:p>
+      <w:pPr>
+        <w:spacing w:after="200"/>
+      </w:pPr>
+      <w:r>
+        <w:rPr>
+          <w:b/>
+          <w:bCs/>
+        </w:rPr>
+        <w:t xml:space="preserve">Webadres: </w:t>
+      </w:r>
+      <w:r>
+        <w:rPr>
+          <w:color w:val="2563EB"/>
+          <w:u w:val="single"/>
+        </w:rPr>
+        <w:t>https://digidokters.onrender.com</w:t>
+      </w:r>
+    </w:p>
+    <w:p>
+      <w:pPr>
+        <w:pStyle w:val="Heading2"/>
+      </w:pPr>
+      <w:r>
+        <w:t>2.1 Inloggen</w:t>
+      </w:r>
+    </w:p>
+    <w:p>
+      <w:pPr>
+        <w:spacing w:after="160"/>
+      </w:pPr>
+      <w:r>
+        <w:t>Log in met uw naam en wachtwoord, zoals aangemaakt door de beheerder.</w:t>
       </w:r>
     </w:p>
     <w:p>
@@ -391,28 +345,7 @@
         <w:spacing w:after="80"/>
       </w:pPr>
       <w:r>
-        <w:t>Bevestig door op 'Installeren' te tikken.</w:t>
-      </w:r>
-    </w:p>
-    <w:p>
-      <w:pPr>
-        <w:spacing w:after="160"/>
-      </w:pPr>
-    </w:p>
-    <w:p>
-      <w:pPr>
-        <w:spacing w:after="160"/>
-      </w:pPr>
-      <w:r>
-        <w:t>De app verschijnt vervolgens als apart icoon in uw app-lade, los van de browser.</w:t>
-      </w:r>
-    </w:p>
-    <w:p>
-      <w:pPr>
-        <w:pStyle w:val="Heading2"/>
-      </w:pPr>
-      <w:r>
-        <w:t>3.3 Op computer (Windows / Mac)</w:t>
+        <w:t>Ga naar https://digidokters.onrender.com</w:t>
       </w:r>
     </w:p>
     <w:p>
@@ -425,7 +358,7 @@
         <w:spacing w:after="80"/>
       </w:pPr>
       <w:r>
-        <w:t>Open de website in Chrome of Edge.</w:t>
+        <w:t>Vul uw naam in bij 'Naam'.</w:t>
       </w:r>
     </w:p>
     <w:p>
@@ -438,7 +371,7 @@
         <w:spacing w:after="80"/>
       </w:pPr>
       <w:r>
-        <w:t>Klik op het installatie-icoontje rechts in de adresbalk (een beeldscherm met pijltje).</w:t>
+        <w:t>Vul uw wachtwoord in.</w:t>
       </w:r>
     </w:p>
     <w:p>
@@ -451,7 +384,7 @@
         <w:spacing w:after="80"/>
       </w:pPr>
       <w:r>
-        <w:t>Klik op 'Installeren'.</w:t>
+        <w:t>Klik op 'Aanmelden'.</w:t>
       </w:r>
     </w:p>
     <w:p>
@@ -461,22 +394,87 @@
     </w:p>
     <w:p>
       <w:pPr>
-        <w:pBdr>
-          <w:left w:val="single" w:sz="18" w:space="8" w:color="2563EB"/>
-        </w:pBdr>
-        <w:shd w:val="clear" w:color="auto" w:fill="F1F5F9"/>
-        <w:spacing w:before="100" w:after="200"/>
-        <w:ind w:left="215"/>
-      </w:pPr>
-      <w:r>
-        <w:rPr>
-          <w:b/>
-          <w:bCs/>
-        </w:rPr>
-        <w:t xml:space="preserve">Tip: </w:t>
-      </w:r>
-      <w:r>
-        <w:t>Na installatie werkt de app hetzelfde als in de browser — het is enkel een snellere, opgeruimdere manier om ze te openen.</w:t>
+        <w:spacing w:after="160"/>
+      </w:pPr>
+      <w:r>
+        <w:t>Bij de allereerste aanmelding met een tijdelijk wachtwoord vraagt de app u om onmiddellijk een nieuw, persoonlijk wachtwoord in te stellen. Dit wachtwoord moet minstens 8 tekens bevatten, met minstens één hoofdletter en één cijfer.</w:t>
+      </w:r>
+    </w:p>
+    <w:p>
+      <w:pPr>
+        <w:pStyle w:val="Heading1"/>
+      </w:pPr>
+      <w:r>
+        <w:t>3. De app gebruiken</w:t>
+      </w:r>
+    </w:p>
+    <w:p>
+      <w:pPr>
+        <w:pStyle w:val="Heading2"/>
+      </w:pPr>
+      <w:r>
+        <w:t>3.1 Registraties bekijken</w:t>
+      </w:r>
+    </w:p>
+    <w:p>
+      <w:pPr>
+        <w:spacing w:after="160"/>
+      </w:pPr>
+      <w:r>
+        <w:t>Het menu-item 'Registraties' toont een overzicht van alle geregistreerde bezoeken: datum, cliënt, digidokter, onderwerp, leeftijdscategorie en toestel. U kan de lijst doorzoeken en filteren.</w:t>
+      </w:r>
+    </w:p>
+    <w:p>
+      <w:pPr>
+        <w:pStyle w:val="Heading2"/>
+      </w:pPr>
+      <w:r>
+        <w:t>3.2 Een nieuw bezoek registreren</w:t>
+      </w:r>
+    </w:p>
+    <w:p>
+      <w:pPr>
+        <w:spacing w:after="160"/>
+      </w:pPr>
+      <w:r>
+        <w:t>Klik in het menu op 'Nieuw bezoek' om een nieuwe registratie toe te voegen. Vul de gevraagde gegevens in (datum, naam van de cliënt, digidokter, leeftijdscategorie, toestel en een korte omschrijving van de hulpvraag) en klik op 'Opslaan'.</w:t>
+      </w:r>
+    </w:p>
+    <w:p>
+      <w:pPr>
+        <w:pStyle w:val="Heading2"/>
+      </w:pPr>
+      <w:r>
+        <w:t>3.3 Exporteren</w:t>
+      </w:r>
+    </w:p>
+    <w:p>
+      <w:pPr>
+        <w:spacing w:after="160"/>
+      </w:pPr>
+      <w:r>
+        <w:t>Via 'Exporteren' kan u alle (of gefilterde) registraties downloaden als Excel-bestand.</w:t>
+      </w:r>
+    </w:p>
+    <w:p>
+      <w:pPr>
+        <w:pStyle w:val="Heading2"/>
+      </w:pPr>
+      <w:r>
+        <w:t>3.4 Statistieken</w:t>
+      </w:r>
+    </w:p>
+    <w:p>
+      <w:pPr>
+        <w:spacing w:after="160"/>
+      </w:pPr>
+      <w:r>
+        <w:t>Onder 'Statistieken' vindt u overzichten en grafieken: aantal bezoeken per digidokter, per leeftijdscategorie, per toestel, en de evolutie doorheen het jaar.</w:t>
+      </w:r>
+    </w:p>
+    <w:p>
+      <w:r>
+        <w:br w:type="page"/>
       </w:r>
     </w:p>
     <w:p>

</xml_diff>

<commit_message>
Add Beheer (for admins) section to handleiding docx
</commit_message>
<xml_diff>
--- a/Digidokters_Gebruikershandleiding.docx
+++ b/Digidokters_Gebruikershandleiding.docx
@@ -475,6 +475,71 @@
     <w:p>
       <w:r>
         <w:br w:type="page"/>
+      </w:r>
+    </w:p>
+    <w:p>
+      <w:pPr>
+        <w:pStyle w:val="Heading1"/>
+      </w:pPr>
+      <w:r>
+        <w:t>4. Beheer (voor beheerders)</w:t>
+      </w:r>
+    </w:p>
+    <w:p>
+      <w:r>
+        <w:t>Gebruikers met de rol 'beheerder' of 'platformbeheerder' hebben toegang tot extra menu-items in de sidebar onder de sectie 'Beheer'.</w:t>
+      </w:r>
+    </w:p>
+    <w:p>
+      <w:pPr>
+        <w:pStyle w:val="Heading2"/>
+      </w:pPr>
+      <w:r>
+        <w:t>4.1 Gebruikersbeheer</w:t>
+      </w:r>
+    </w:p>
+    <w:p>
+      <w:r>
+        <w:t>Via 'Beheer &gt; Gebruikers' kunt u de medewerkers en beheerders van uw organisatie beheren. U kunt nieuwe gebruikers aanmaken, hun gegevens wijzigen en hun actieve status in- of uitschakelen. Alleen platformbeheerders kunnen de rol 'platformbeheerder' toekennen.</w:t>
+      </w:r>
+    </w:p>
+    <w:p>
+      <w:pPr>
+        <w:pStyle w:val="Heading2"/>
+      </w:pPr>
+      <w:r>
+        <w:t>4.2 Stamgegevens beheren</w:t>
+      </w:r>
+    </w:p>
+    <w:p>
+      <w:r>
+        <w:t>Onder 'Beheer' vindt u pagina's voor 'Digidokters', 'Leeftijdscategorieën' en 'Toestellen'. Hier kunt u opties toevoegen, wijzigen of deactiveren. Met de pijltjes-knoppen kunt u de weergavevolgorde in het registratieformulier aanpassen.</w:t>
+      </w:r>
+    </w:p>
+    <w:p>
+      <w:pPr>
+        <w:pStyle w:val="Heading2"/>
+      </w:pPr>
+      <w:r>
+        <w:t>4.3 Backup &amp; Restore</w:t>
+      </w:r>
+    </w:p>
+    <w:p>
+      <w:r>
+        <w:t>Via 'Backup' kunt u alle gegevens van de organisatie (gebruikers, instellingen en registraties) downloaden als een JSON-bestand. Via 'Restore' kunt u een eerder opgeslagen JSON-backup uploaden om de gegevens te herstellen. Let op: het herstellen overschrijft alle huidige gegevens van de organisatie permanent.</w:t>
+      </w:r>
+    </w:p>
+    <w:p>
+      <w:pPr>
+        <w:pStyle w:val="Heading2"/>
+      </w:pPr>
+      <w:r>
+        <w:t>4.4 Platformbeheer (enkel platformbeheerders)</w:t>
+      </w:r>
+    </w:p>
+    <w:p>
+      <w:r>
+        <w:t>Gebruikers met de rol 'platformbeheerder' hebben toegang tot het menu 'Platformbeheer'. Hier kunnen zij nieuwe organisaties toevoegen, bewerken en gebruikers koppelen aan of ontkoppelen van organisaties.</w:t>
       </w:r>
     </w:p>
     <w:p>

</xml_diff>

<commit_message>
Fix e-mail unique constraint opschoning en verwerking voor PostgreSQL
</commit_message>
<xml_diff>
--- a/Digidokters_Gebruikershandleiding.docx
+++ b/Digidokters_Gebruikershandleiding.docx
@@ -421,7 +421,7 @@
         <w:spacing w:after="160"/>
       </w:pPr>
       <w:r>
-        <w:t>Het menu-item 'Registraties' toont een overzicht van alle geregistreerde bezoeken: datum, cliënt, digidokter, onderwerp, leeftijdscategorie en toestel. U kan de lijst doorzoeken en filteren.</w:t>
+        <w:t>Het menu-item 'Registraties' toont een overzicht van alle geregistreerde bezoeken: datum, cliënt, digidokter, onderwerp, leeftijdscategorie en toestel. U kan de lijst doorzoeken en filteren. Medewerkers en beheerders kunnen hier ook registraties verwijderen (wissen) bij invoerfouten.</w:t>
       </w:r>
     </w:p>
     <w:p>
@@ -469,7 +469,7 @@
         <w:spacing w:after="160"/>
       </w:pPr>
       <w:r>
-        <w:t>Onder 'Statistieken' vindt u overzichten en grafieken: aantal bezoeken per digidokter, per leeftijdscategorie, per toestel, en de evolutie doorheen het jaar.</w:t>
+        <w:t>Onder 'Statistieken' vindt u overzichten en grafieken verdeeld over twee tabbladen: 'Bezoekers &amp; Consultaties' (bezoeken, leeftijdscategorieën, toestellen, geslachtsverdeling en wekelijkse trends) en 'Vrijwilligers &amp; Agenda' (totaal gepresteerde uren door digidokters, urentrend per maand, inzet per digidokter, sessies per locatie/type en de bezoeker/vrijwilliger-ratio).</w:t>
       </w:r>
     </w:p>
     <w:p>
@@ -479,6 +479,19 @@
     </w:p>
     <w:p>
       <w:pPr>
+        <w:pStyle w:val="Heading2"/>
+      </w:pPr>
+      <w:r>
+        <w:t>3.5 Agenda &amp; Planning</w:t>
+      </w:r>
+    </w:p>
+    <w:p>
+      <w:r>
+        <w:t>Via het menu-item 'Agenda' kan u geplande activiteiten bekijken, filteren op datum, type, locatie en digidokter, en sorteren op elke kolom. Medewerkers en beheerders kunnen hier ook nieuwe eenmalige of terugkerende activiteiten inplannen, bewerken of verwijderen. Bij het registreren of wijzigen van een activiteit kan u selecteren welke (actieve) digidokters aanwezig zullen zijn.</w:t>
+      </w:r>
+    </w:p>
+    <w:p>
+      <w:pPr>
         <w:pStyle w:val="Heading1"/>
       </w:pPr>
       <w:r>
@@ -513,7 +526,7 @@
     </w:p>
     <w:p>
       <w:r>
-        <w:t>Onder 'Beheer' vindt u pagina's voor 'Digidokters', 'Leeftijdscategorieën' en 'Toestellen'. Hier kunt u opties toevoegen, wijzigen of deactiveren. Met de pijltjes-knoppen kunt u de weergavevolgorde in het registratieformulier aanpassen.</w:t>
+        <w:t>Onder 'Beheer' vindt u pagina's voor 'Digidokters', 'Activiteitstypes', 'Locaties', 'Leeftijdscategorieën' en 'Toestellen'. Hier kunt u opties toevoegen, wijzigen of deactiveren (zoals het instellen of een Digidokter 'Actief' is). Met de pijltjes-knoppen kunt u de weergavevolgorde in de formulieren aanpassen.</w:t>
       </w:r>
     </w:p>
     <w:p>

</xml_diff>

<commit_message>
Voeg Documentbeheer module toe (mappenstructuur, upload/download, overschrijven en handleiding)
</commit_message>
<xml_diff>
--- a/Digidokters_Gebruikershandleiding.docx
+++ b/Digidokters_Gebruikershandleiding.docx
@@ -488,6 +488,30 @@
     <w:p>
       <w:r>
         <w:t>Via het menu-item 'Agenda' kan u geplande activiteiten bekijken, filteren op datum, type, locatie en digidokter, en sorteren op elke kolom. Medewerkers en beheerders kunnen hier ook nieuwe eenmalige of terugkerende activiteiten inplannen, bewerken of verwijderen. Bij het registreren of wijzigen van een activiteit kan u selecteren welke (actieve) digidokters aanwezig zullen zijn.</w:t>
+      </w:r>
+    </w:p>
+    <w:p>
+      <w:pPr>
+        <w:pStyle w:val="Heading2"/>
+      </w:pPr>
+      <w:r>
+        <w:t>3.6 Documentbeheer</w:t>
+      </w:r>
+    </w:p>
+    <w:p>
+      <w:pPr/>
+      <w:r>
+        <w:t>Via het menu-item 'Documenten' kunt u documenten en mappen beheren binnen uw organisatie (toegankelijk voor medewerkers, beheerders en platformbeheerder; niet voor lezers).</w:t>
+        <w:br/>
+        <w:t>• Mappenstructuur: U kunt nieuwe mappen aanmaken, hernoemen of verwijderen om uw bestanden overzichtelijk in te delen (inclusief submappen).</w:t>
+        <w:br/>
+        <w:t>• Documenten uploaden: U kunt bestanden uploaden (zoals PDF, Word, Excel, afbeeldingen). De maximale bestandsgrootte bedraagt 16 MB per bestand.</w:t>
+        <w:br/>
+        <w:t>• Bekijken &amp; Downloaden: Klik op het download-icoontje om een bestand op te slaan, of bekijk PDF- en afbeeldingsbestanden rechtstreeks in de browser via het oog-icoontje.</w:t>
+        <w:br/>
+        <w:t>• Versiebeheer (overschrijven): Bij het uploaden van een nieuwe versie via de knop 'Nieuwe versie uploaden' wordt het document vervangen en wordt het versienummer automatisch opgehoogd (v1, v2, v3, ...).</w:t>
+        <w:br/>
+        <w:t>• Details bewerken &amp; verwijderen: U kunt de bestandsnaam en een optionele omschrijving bewerken of een document definitief verwijderen.</w:t>
       </w:r>
     </w:p>
     <w:p>

</xml_diff>

<commit_message>
Voeg database auditing (AuditLog) met beheer-GUI, discrete record-IDs en handleiding-updates toe
</commit_message>
<xml_diff>
--- a/Digidokters_Gebruikershandleiding.docx
+++ b/Digidokters_Gebruikershandleiding.docx
@@ -595,7 +595,25 @@
         <w:pStyle w:val="Heading2"/>
       </w:pPr>
       <w:r>
-        <w:t>4.4 Platformbeheer (enkel platformbeheerders)</w:t>
+        <w:t>4.4 Audit Logs</w:t>
+      </w:r>
+    </w:p>
+    <w:p>
+      <w:pPr/>
+      <w:r>
+        <w:t>Beheerders en platformbeheerders kunnen alle wijzigingen aan gegevens binnen de applicatie raadplegen via het menu 'Beheer &gt; Audit Logs'.</w:t>
+        <w:br/>
+        <w:t>Hier wordt automatisch elke CRUD-actie (aanmaken, wijzigen, verwijderen) geregistreerd met het tijdstip, de uitvoerende gebruiker, de tabelnaam en het record-ID. U kunt de lijst filteren op datum (van-tot), gebruiker, operatie (CREATE, UPDATE, DELETE) en tabel. Klik op de knop 'Details' bij een log-item om de gewijzigde velden in een overzichtelijke tabel te vergelijken (oude versus nieuwe waarden).</w:t>
+        <w:br/>
+        <w:t>Ter ondersteuning zijn de unieke record-IDs van alle gegevens discreet in de gebruikersinterface vermeld (bijv. '#X' of 'ID: X' bij registraties, agenda-items, mappen en stamgegevens), zodat u deze eenvoudig kunt matchen met de audit logs.</w:t>
+      </w:r>
+    </w:p>
+    <w:p>
+      <w:pPr>
+        <w:pStyle w:val="Heading2"/>
+      </w:pPr>
+      <w:r>
+        <w:t>4.5 Platformbeheer (enkel platformbeheerders)</w:t>
       </w:r>
     </w:p>
     <w:p>

</xml_diff>

<commit_message>
Plaats handleiding sectie 2.2 inhoud op de juiste plek onder de heading
</commit_message>
<xml_diff>
--- a/Digidokters_Gebruikershandleiding.docx
+++ b/Digidokters_Gebruikershandleiding.docx
@@ -398,6 +398,14 @@
       </w:pPr>
       <w:r>
         <w:t>Bij de allereerste aanmelding met een tijdelijk wachtwoord vraagt de app u om onmiddellijk een nieuw, persoonlijk wachtwoord in te stellen. Dit wachtwoord moet minstens 8 tekens bevatten, met minstens één hoofdletter en één cijfer.</w:t>
+      </w:r>
+    </w:p>
+    <w:p>
+      <w:pPr>
+        <w:pStyle w:val="Heading2"/>
+      </w:pPr>
+      <w:r>
+        <w:t>2.2 Wachtwoord vergeten</w:t>
       </w:r>
     </w:p>
     <w:p>
@@ -414,14 +422,6 @@
         <w:t>4. Voer de 6-cijferige code in op het scherm, samen met uw nieuwe wachtwoord (minstens 8 tekens, 1 hoofdletter, 1 cijfer).</w:t>
         <w:br/>
         <w:t>5. Na succesvolle verificatie is uw wachtwoord direct gewijzigd en kunt u inloggen.</w:t>
-      </w:r>
-    </w:p>
-    <w:p>
-      <w:pPr>
-        <w:pStyle w:val="Heading2"/>
-      </w:pPr>
-      <w:r>
-        <w:t>2.2 Wachtwoord vergeten</w:t>
       </w:r>
     </w:p>
     <w:p>

</xml_diff>

<commit_message>
Wijzig admin e-mailadres van mark.vandenbroeck@gmail.com naar digidokters.admin@gmail.com
</commit_message>
<xml_diff>
--- a/Digidokters_Gebruikershandleiding.docx
+++ b/Digidokters_Gebruikershandleiding.docx
@@ -631,34 +631,7 @@
         <w:jc w:val="center"/>
       </w:pPr>
       <w:r>
-        <w:rPr>
-          <w:i/>
-          <w:iCs/>
-          <w:color w:val="64748B"/>
-          <w:sz w:val="20"/>
-          <w:szCs w:val="20"/>
-        </w:rPr>
-        <w:t xml:space="preserve">Vragen of problemen? Contacteer </w:t>
-      </w:r>
-      <w:r>
-        <w:rPr>
-          <w:i/>
-          <w:iCs/>
-          <w:color w:val="64748B"/>
-          <w:sz w:val="20"/>
-          <w:szCs w:val="20"/>
-        </w:rPr>
-        <w:t>Mark (mark.vandenbroeck@gmail.com)</w:t>
-      </w:r>
-      <w:r>
-        <w:rPr>
-          <w:i/>
-          <w:iCs/>
-          <w:color w:val="64748B"/>
-          <w:sz w:val="20"/>
-          <w:szCs w:val="20"/>
-        </w:rPr>
-        <w:t>.</w:t>
+        <w:t>Vragen of problemen? Contacteer Mark (digidokters.admin@gmail.com).</w:t>
       </w:r>
     </w:p>
     <w:sectPr>

</xml_diff>

<commit_message>
Implementeer AVG/GDPR aanbevelingen voor dataminimalisatie, automatische log-opschoning bij verwijdering en privacyverklaring in UI en handleiding
</commit_message>
<xml_diff>
--- a/Digidokters_Gebruikershandleiding.docx
+++ b/Digidokters_Gebruikershandleiding.docx
@@ -462,6 +462,20 @@
       </w:pPr>
       <w:r>
         <w:t>Klik in het menu op 'Nieuw bezoek' om een nieuwe registratie toe te voegen. Vul de gevraagde gegevens in (datum, naam van de cliënt, digidokter, leeftijdscategorie, toestel en een korte omschrijving van de hulpvraag) en klik op 'Opslaan'.</w:t>
+      </w:r>
+    </w:p>
+    <w:p>
+      <w:r>
+        <w:rPr>
+          <w:b/>
+        </w:rPr>
+        <w:t>Belangrijk (AVG/GDPR-richtlijnen):</w:t>
+        <w:br/>
+      </w:r>
+      <w:r>
+        <w:t>• Dataminimalisatie: Noteer bij 'Cliënt' uitsluitend de voornaam of initialen (bijv. 'Jan' of 'J.P.'). Voer om privacyredenen geen volledige namen in.</w:t>
+        <w:br/>
+        <w:t>• Anoniem omschrijven: Houd de omschrijving van de hulpvraag bij 'Onderwerp' functioneel en anoniem. Voer geen medische of andere gevoelige gegevens in (schrijf dus: 'Hulp bij inloggen eHealth' in plaats van 'Hulp bij inloggen MyHealth vanwege diabetesrapport').</w:t>
       </w:r>
     </w:p>
     <w:p>

</xml_diff>

<commit_message>
Implementeer herkomst als stamgegeven met CRUD-beheer, dropdowns, import/export, statistieken en geautomatiseerde testen
</commit_message>
<xml_diff>
--- a/Digidokters_Gebruikershandleiding.docx
+++ b/Digidokters_Gebruikershandleiding.docx
@@ -445,7 +445,7 @@
         <w:spacing w:after="160"/>
       </w:pPr>
       <w:r>
-        <w:t>Het menu-item 'Registraties' toont een overzicht van alle geregistreerde bezoeken: datum, cliënt, digidokter, onderwerp, leeftijdscategorie en toestel. U kan de lijst doorzoeken en filteren. Medewerkers en beheerders kunnen hier ook registraties verwijderen (wissen) bij invoerfouten.</w:t>
+        <w:t>Het menu-item 'Registraties' toont een overzicht van alle geregistreerde bezoeken: datum, cliënt, digidokter, herkomst, onderwerp, leeftijdscategorie en toestel. U kan de lijst doorzoeken en filteren. Medewerkers en beheerders kunnen hier ook registraties verwijderen (wissen) bij invoerfouten.</w:t>
       </w:r>
     </w:p>
     <w:p>
@@ -461,7 +461,7 @@
         <w:spacing w:after="160"/>
       </w:pPr>
       <w:r>
-        <w:t>Klik in het menu op 'Nieuw bezoek' om een nieuwe registratie toe te voegen. Vul de gevraagde gegevens in (datum, naam van de cliënt, digidokter, leeftijdscategorie, toestel en een korte omschrijving van de hulpvraag) en klik op 'Opslaan'.</w:t>
+        <w:t>Klik in het menu op 'Nieuw bezoek' om een nieuwe registratie toe te voegen. Vul de gevraagde gegevens in (datum, naam van de cliënt, digidokter, herkomst, leeftijdscategorie, toestel en een korte omschrijving van de hulpvraag) en klik op 'Opslaan'.</w:t>
       </w:r>
     </w:p>
     <w:p>
@@ -507,7 +507,7 @@
         <w:spacing w:after="160"/>
       </w:pPr>
       <w:r>
-        <w:t>Onder 'Statistieken' vindt u overzichten en grafieken verdeeld over twee tabbladen: 'Bezoekers &amp; Consultaties' (bezoeken, leeftijdscategorieën, toestellen, geslachtsverdeling en wekelijkse trends) en 'Vrijwilligers &amp; Agenda' (totaal gepresteerde uren door digidokters, urentrend per maand, inzet per digidokter, sessies per locatie/type en de bezoeker/vrijwilliger-ratio). De 'Bezoeker/vrijwilliger-ratio' (druktest) houdt uitsluitend rekening met activiteiten uit het verleden, omdat toekomstige activiteiten meestal nog geen geregistreerde bezoeken hebben.</w:t>
+        <w:t>Onder 'Statistieken' vindt u overzichten en grafieken verdeeld over twee tabbladen: 'Bezoekers &amp; Consultaties' (bezoeken, leeftijdscategorieën, toestellen, herkomst, geslachtsverdeling en wekelijkse trends) en 'Vrijwilligers &amp; Agenda' (totaal gepresteerde uren door digidokters, urentrend per maand, inzet per digidokter, sessies per locatie/type en de bezoeker/vrijwilliger-ratio). De 'Bezoeker/vrijwilliger-ratio' (druktest) houdt uitsluitend rekening met activiteiten uit het verleden, omdat toekomstige activiteiten meestal nog geen geregistreerde bezoeken hebben.</w:t>
       </w:r>
     </w:p>
     <w:p>
@@ -588,7 +588,7 @@
     </w:p>
     <w:p>
       <w:r>
-        <w:t>Onder 'Beheer' vindt u pagina's voor 'Digidokters', 'Activiteitstypes', 'Locaties', 'Leeftijdscategorieën' en 'Toestellen'. Hier kunt u opties toevoegen, wijzigen of deactiveren (zoals het instellen of een Digidokter 'Actief' is). Met de pijltjes-knoppen kunt u de weergavevolgorde in de formulieren aanpassen. Voor 'Activiteitstypes' kunt u bovendien de status 'Actief' wijzigen en een specifieke kleur selecteren voor de badge in de agenda (Blauw, Teal, Paars, Oranje). In het overzichtsscherm ziet u direct een live gekleurde preview van de badge.</w:t>
+        <w:t>Onder 'Beheer' vindt u pagina's voor 'Digidokters', 'Activiteitstypes', 'Locaties', 'Leeftijdscategorieën' 'Toestellen' en 'Herkomst'. Hier kunt u opties toevoegen, wijzigen of deactiveren (zoals het instellen of een Digidokter 'Actief' is). Met de pijltjes-knoppen kunt u de weergavevolgorde in de formulieren aanpassen. Voor 'Activiteitstypes' kunt u bovendien de status 'Actief' wijzigen en een specifieke kleur selecteren voor de badge in de agenda (Blauw, Teal, Paars, Oranje). In het overzichtsscherm ziet u direct een live gekleurde preview van de badge.</w:t>
       </w:r>
     </w:p>
     <w:p>

</xml_diff>

<commit_message>
Verbeteringen aan digidokters, gebruikersbeheer, login flow en documentatie
</commit_message>
<xml_diff>
--- a/Digidokters_Gebruikershandleiding.docx
+++ b/Digidokters_Gebruikershandleiding.docx
@@ -332,7 +332,7 @@
         <w:spacing w:after="160"/>
       </w:pPr>
       <w:r>
-        <w:t>Log in met uw naam en wachtwoord, zoals aangemaakt door de beheerder.</w:t>
+        <w:t>Log in met uw e-mailadres en wachtwoord, zoals aangemaakt door de beheerder.</w:t>
       </w:r>
     </w:p>
     <w:p>
@@ -358,7 +358,7 @@
         <w:spacing w:after="80"/>
       </w:pPr>
       <w:r>
-        <w:t>Vul uw naam in bij 'Naam'.</w:t>
+        <w:t>Vul uw e-mailadres in bij 'E-mailadres'.</w:t>
       </w:r>
     </w:p>
     <w:p>
@@ -415,7 +415,7 @@
         <w:br/>
         <w:t>1. Klik in het inlogscherm op de link 'Wachtwoord vergeten?'.</w:t>
         <w:br/>
-        <w:t>2. Vul uw gebruikersnaam in en klik op 'Herstelcode aanvragen'.</w:t>
+        <w:t>2. Vul uw e-mailadres in en klik op 'Herstelcode aanvragen'.</w:t>
         <w:br/>
         <w:t>3. U ontvangt een e-mail met een 6-cijferige verificatiecode. Deze code is 30 minuten geldig.</w:t>
         <w:br/>
@@ -575,7 +575,7 @@
     </w:p>
     <w:p>
       <w:r>
-        <w:t>Via 'Beheer &gt; Gebruikers' kunt u de medewerkers en beheerders van uw organisatie beheren. U kunt nieuwe gebruikers aanmaken, hun gegevens wijzigen en hun actieve status in- of uitschakelen. Alleen platformbeheerders kunnen de rol 'platformbeheerder' toekennen.</w:t>
+        <w:t>Via 'Beheer &gt; Gebruikers' kunt u de medewerkers en beheerders van uw organisatie beheren. Elk account vereist een uniek e-mailadres waarmee de gebruiker kan inloggen. U kunt nieuwe gebruikers aanmaken, hun gegevens of rol wijzigen, hun actieve status in- of uitschakelen, en de tabel op elke kolom sorteren. Gebruikers op wier naam nog geen registraties staan kunnen hier ook definitief verwijderd worden. Alleen platformbeheerders kunnen de rol 'platformbeheerder' toekennen.</w:t>
       </w:r>
     </w:p>
     <w:p>

</xml_diff>

<commit_message>
Voeg sjabloon-organisatie, organisatie-verwijdering en referentie-beveiligd wissen van stamgegevens toe
</commit_message>
<xml_diff>
--- a/Digidokters_Gebruikershandleiding.docx
+++ b/Digidokters_Gebruikershandleiding.docx
@@ -455,7 +455,20 @@
     <w:p>
       <w:pPr/>
       <w:r>
-        <w:t>Onder 'Beheer' vindt u pagina's voor 'Digidokters', 'Activiteitstypes', 'Locaties', 'Leeftijdscategorieën', 'Toestellen' en 'Herkomst'. Hier kunt u opties toevoegen, wijzigen of deactiveren (zoals het instellen of een Digidokter 'Actief' is). Met de pijltjes-knoppen kunt u de weergavevolgorde in de formulieren aanpassen. Voor 'Activiteitstypes' kunt u bovendien de status 'Actief' wijzigen, een specifieke kleur selecteren voor de badge in de agenda (Blauw, Teal, Paars, Oranje), en aanduiden of een 'Evaluatieformulier gewenst' is (standaard ingeschakeld voor Digicafé). In het overzichtsscherm ziet u een live gekleurde preview van de badge en een directe knop 'Configureren' om het evaluatieformulier te beheren.</w:t>
+        <w:t>Onder 'Beheer' vindt u pagina's voor 'Digidokters', 'Activiteitstypes', 'Locaties', 'Leeftijdscategorieën', 'Toestellen' en 'Herkomst'. Hier kunt u opties toevoegen, wijzigen, deactiveren of definitief wissen. Met de pijltjes-knoppen kunt u de weergavevolgorde in de formulieren aanpassen. Voor 'Activiteitstypes' kunt u bovendien de status 'Actief' wijzigen, een specifieke kleur selecteren voor de badge in de agenda (Blauw, Teal, Paars, Oranje), en aanduiden of een 'Evaluatieformulier gewenst' is (standaard ingeschakeld voor Digicafé). In het overzichtsscherm ziet u een live gekleurde preview van de badge en een directe knop 'Configureren' om het evaluatieformulier te beheren.</w:t>
+        <w:br/>
+        <w:br/>
+        <w:t>Stamgegevens wissen &amp; referentiecontroles:</w:t>
+        <w:br/>
+        <w:t>Het definitief wissen van stamgegevens is enkel toegestaan voor beheerders en platformbeheerders, en uitsluitend wanneer er géén andere gegevens naar verwijzen:</w:t>
+        <w:br/>
+        <w:t>• Locaties: kunnen enkel worden gewist als er geen gekoppelde agenda-activiteiten aan verbonden zijn.</w:t>
+        <w:br/>
+        <w:t>• Activiteitstypes: kunnen enkel worden gewist als er geen gekoppelde agenda-activiteiten of ingevulde evaluaties aan verbonden zijn (een leeg evaluatieformulier zonder reacties wordt automatisch mee opgeruimd).</w:t>
+        <w:br/>
+        <w:t>• Leeftijdscategorieën, Toestellen en Herkomst: kunnen enkel worden gewist als er geen geregistreerde consultaties aan gekoppeld zijn.</w:t>
+        <w:br/>
+        <w:t>Indien een item nog gekoppelde records heeft, is de verwijderknop automatisch uitgeschakeld met een verhelderende tooltip en het advies om het item te deactiveren in plaats van te wissen.</w:t>
       </w:r>
     </w:p>
     <w:p>
@@ -521,7 +534,19 @@
     <w:p>
       <w:pPr/>
       <w:r>
-        <w:t>Gebruikers met de rol 'platformbeheerder' hebben toegang tot het menu 'Platformbeheer'. Hier kunnen zij nieuwe organisaties toevoegen, bewerken en gebruikers koppelen aan of ontkoppelen van organisaties.</w:t>
+        <w:t>Gebruikers met de rol 'platformbeheerder' hebben toegang tot het menu 'Platformbeheer':</w:t>
+        <w:br/>
+        <w:t>• Organisaties toevoegen &amp; bewerken: Nieuwe organisaties kunnen worden aangemaakt. Bij aanmaak worden alle actieve stamgegevens automatisch als blauwdruk gekopieerd uit de 'Sjabloon'-organisatie.</w:t>
+        <w:br/>
+        <w:t>• Centrale Sjabloon-organisatie: De speciale organisatie 'Sjabloon' (slug: sjabloon) fungeert als referentiemodel voor het hele platform. Alle actieve stamgegevens (leeftijdscategorieën, toestellen, activiteitstypes, Digicafé evaluatieformulier en vragen, locaties en herkomsten) die hierin staan, vormen de standaard voor nieuwe organisaties. Pas je als platformbeheerder de stamgegevens van 'Sjabloon' aan, dan nemen toekomstige organisaties automatisch die nieuwe standaarden over.</w:t>
+        <w:br/>
+        <w:t>• Exclusieve toegang tot Sjabloon: Uitsluitend platformbeheerders kunnen overschakelen naar de 'Sjabloon'-organisatie. Reguliere gebruikers (beheerders, medewerkers, lezers) hebben geen toegang tot deze tenant en kunnen er niet aan gekoppeld worden.</w:t>
+        <w:br/>
+        <w:t>• Organisaties activeren / deactiveren: Met het slot-icoontje kan een organisatie tijdelijk worden gedeactiveerd om aanmeldingen te blokkeren.</w:t>
+        <w:br/>
+        <w:t>• Organisaties wissen (definitief): Via het rode vuilnisbak-icoontje kan een overbodige organisatie definitief worden gewist. Dit verwijdert ALLE geassocieerde data onomkeerbaar: registraties, agenda-activiteiten, evaluatieformulieren &amp; reacties, documenten, mappen, stamgegevens en gebruikerskoppelingen. Zowel de hoofdorganisatie (ID 1) als de Sjabloon-organisatie zijn beschermd en kunnen nooit gewist worden.</w:t>
+        <w:br/>
+        <w:t>• Gebruikers koppelen: Platformbeheerders kunnen gebruikers toewijzen aan specifieke organisaties met de gewenste rol ('beheerder', 'medewerker' of 'lezer').</w:t>
       </w:r>
     </w:p>
     <w:p>

</xml_diff>

<commit_message>
Voeg globaal platformdashboard en aanpasbare e-mailsjablonen toe
- Globaal platformdashboard voor platformbeheerders met geaggregeerde consultaties, actieve vrijwilligers, gemeentespreiding, Chart.js visualisaties, aggregatietabel en jaarfilter.
- Aanpasbare e-mailsjablonen (uitnodiging en herinnering) met beheerinterface, live preview, dynamische variabelen en fabrieksherstel.
- Gerichte evaluatie-herinneringen en tracking in evaluatie-uitnodigingen.
- Bijgewerkte README.md en gebruikershandleiding.
- Database migratie e8c9f1a2b345 en uitgebreide tests.
</commit_message>
<xml_diff>
--- a/Digidokters_Gebruikershandleiding.docx
+++ b/Digidokters_Gebruikershandleiding.docx
@@ -491,6 +491,8 @@
         <w:t>• E-mailuitnodigingen opvolgen: In het overzicht ziet u direct de recent afgelopen sessies, hoeveel digidokters aanwezig waren en hoeveel evaluaties reeds zijn ingevuld. Beheerders kunnen ook met één klik handmatig (opnieuw) uitnodigingen per mail versturen.</w:t>
         <w:br/>
         <w:t>• Evaluatieresultaten raadplegen: Via de knop 'Bekijk alle resultaten' (of via de detailknop bij een sessie) krijgt u een overzicht van alle ingevulde evaluaties. U kunt hier filteren op activiteitstype en met de schakelaar 'Enkel activiteiten met minstens 1 ingevulde evaluatie' snel inzoomen op sessies met feedback. Klik op 'Bekijk antwoorden' om alle individuele reacties en opmerkingen per digidokter overzichtelijk in te kijken.</w:t>
+        <w:br/>
+        <w:t>• Herinneringsmails opvolgen &amp; versturen: In het sessiedetailoverzicht ziet u direct per aanwezige digidokter de status van de evaluatie (groen vinkje bij reeds ingevuld, envelop-icoon bij verzonden uitnodiging, of wekker-icoon bij verzonden herinneringen met teller). Met de knop 'Herinneringen verzenden' stuurt u met één klik een gerichte herinneringsmail naar alle digidokters die de evaluatie nog niet hebben ingediend.</w:t>
       </w:r>
     </w:p>
     <w:p>
@@ -549,6 +551,26 @@
         <w:t>• Organisaties wissen (definitief): Via het rode vuilnisbak-icoontje kan een overbodige organisatie definitief worden gewist. Dit verwijdert ALLE geassocieerde data onomkeerbaar: registraties, agenda-activiteiten, evaluatieformulieren &amp; reacties, documenten, mappen, stamgegevens en gebruikerskoppelingen. Zowel de hoofdorganisatie (ID 1) als de Sjabloon-organisatie zijn beschermd en kunnen nooit gewist worden.</w:t>
         <w:br/>
         <w:t>• Gebruikers koppelen: Platformbeheerders kunnen gebruikers toewijzen aan specifieke organisaties met de gewenste rol ('beheerder', 'medewerker' of 'lezer').</w:t>
+        <w:br/>
+        <w:t>• Globaal platformdashboard: Een geaggregeerd dashboard dat realtime statistieken over alle aangesloten gemeenten en organisaties heen toont. Het dashboard toont:</w:t>
+        <w:br/>
+        <w:t xml:space="preserve">  - Totaal aantal consultaties (bezoeken) over het gehele platformnetwerk.</w:t>
+        <w:br/>
+        <w:t xml:space="preserve">  - Aantal actieve vrijwilligers (Digidokters), inclusief telling van unieke personen.</w:t>
+        <w:br/>
+        <w:t xml:space="preserve">  - Spreiding over gemeenten met interactieve visualisaties (staafgrafiek van consultaties per gemeente en doughnutgrafiek van de vrijwilligersverdeling).</w:t>
+        <w:br/>
+        <w:t xml:space="preserve">  - Een gedetailleerde spreidingstabel met het procentueel aandeel van elke gemeente (met visuele voortgangsbalken), aantal sessies en gekoppelde gebruikers.</w:t>
+        <w:br/>
+        <w:t xml:space="preserve">  - Een periodefilter om de data per kalenderjaar of over alle jaren heen te analyseren.</w:t>
+        <w:br/>
+        <w:t>• Aanpasbare e-mailsjablonen: Via 'Platformbeheer &gt; E-mailsjablonen' kunnen platformbeheerders de standaardteksten en onderwerpen van de uitnodigings- en herinneringsmails beheren:</w:t>
+        <w:br/>
+        <w:t xml:space="preserve">  - Dynamische placeholders ({naam}, {activiteit}, {datum}, {uur_van}, {uur_tot}, {locatie}, {omschrijving_blok}, {link}) met klikbare badges om ze direct in de tekst in te voegen.</w:t>
+        <w:br/>
+        <w:t xml:space="preserve">  - Real-time live previewpaneel dat de e-mail met realistische voorbeelddata direct toont tijdens het typen.</w:t>
+        <w:br/>
+        <w:t xml:space="preserve">  - Fabrieksherstel via de knop 'Herstel naar standaard' om een sjabloon te allen tijde terug te zetten naar de originele standaardtekst.</w:t>
       </w:r>
     </w:p>
     <w:p>

</xml_diff>